<commit_message>
Final manuscript fixes: Aisyah surname (A7), warm-room callback in Ch16 (C3)
Co-Authored-By: Claude Sonnet 5.5 <noreply@anthropic.com>

Claude-Session: https://claude.ai/code/session_011sBVAmX35tPxqRASXqkfKn
</commit_message>
<xml_diff>
--- a/01_The_Blue_Silence/Manuscript/THE_BLUE_SILENCE_Chapter_16_Seven_Minutes.docx
+++ b/01_The_Blue_Silence/Manuscript/THE_BLUE_SILENCE_Chapter_16_Seven_Minutes.docx
@@ -93,6 +93,14 @@
       </w:pPr>
       <w:r>
         <w:t>One cup had a skin of milk cooling at the surface.</w:t>
+      </w:r>
+    </w:p>
+    <w:p>
+      <w:pPr>
+        <w:jc w:val="left"/>
+      </w:pPr>
+      <w:r>
+        <w:t>Rahman did not touch the cup. He had held his palm over warm food in the rain, and again over four plates beside a portable stove. He knew what a warm room meant now. This was the third time he had arrived just after the people he came for.</w:t>
       </w:r>
     </w:p>
     <w:p>

</xml_diff>